<commit_message>
Solving some problems in file structure
</commit_message>
<xml_diff>
--- a/pr2_example/Report_pr2.docx
+++ b/pr2_example/Report_pr2.docx
@@ -2540,6 +2540,7 @@
       <w:r>
         <w:rPr>
           <w:bCs/>
+          <w:noProof/>
         </w:rPr>
         <w:drawing>
           <wp:inline distT="0" distB="0" distL="0" distR="0" wp14:anchorId="4E0CECFB" wp14:editId="60EC260F">
@@ -2649,6 +2650,7 @@
       <w:r>
         <w:rPr>
           <w:bCs/>
+          <w:noProof/>
           <w:lang w:val="en-US"/>
         </w:rPr>
         <w:drawing>
@@ -3808,16 +3810,16 @@
           <w:sz w:val="28"/>
           <w:szCs w:val="28"/>
         </w:rPr>
-        <w:t>I a</w:t>
-      </w:r>
-      <w:proofErr w:type="spellStart"/>
-      <w:r>
-        <w:rPr>
-          <w:bCs/>
-          <w:sz w:val="28"/>
-          <w:szCs w:val="28"/>
-        </w:rPr>
-        <w:t>dded</w:t>
+        <w:t xml:space="preserve">I </w:t>
+      </w:r>
+      <w:proofErr w:type="spellStart"/>
+      <w:r>
+        <w:rPr>
+          <w:bCs/>
+          <w:sz w:val="28"/>
+          <w:szCs w:val="28"/>
+        </w:rPr>
+        <w:t>added</w:t>
       </w:r>
       <w:proofErr w:type="spellEnd"/>
       <w:r>
@@ -8132,6 +8134,106 @@
           <w:lang w:val="uk-UA"/>
         </w:rPr>
       </w:pPr>
+      <w:r>
+        <w:rPr>
+          <w:bCs/>
+          <w:sz w:val="28"/>
+          <w:szCs w:val="28"/>
+          <w:lang w:val="uk-UA"/>
+        </w:rPr>
+        <w:t xml:space="preserve">I </w:t>
+      </w:r>
+      <w:proofErr w:type="spellStart"/>
+      <w:r>
+        <w:rPr>
+          <w:bCs/>
+          <w:sz w:val="28"/>
+          <w:szCs w:val="28"/>
+          <w:lang w:val="uk-UA"/>
+        </w:rPr>
+        <w:t>also</w:t>
+      </w:r>
+      <w:proofErr w:type="spellEnd"/>
+      <w:r>
+        <w:rPr>
+          <w:bCs/>
+          <w:sz w:val="28"/>
+          <w:szCs w:val="28"/>
+          <w:lang w:val="uk-UA"/>
+        </w:rPr>
+        <w:t xml:space="preserve"> </w:t>
+      </w:r>
+      <w:proofErr w:type="spellStart"/>
+      <w:r>
+        <w:rPr>
+          <w:bCs/>
+          <w:sz w:val="28"/>
+          <w:szCs w:val="28"/>
+          <w:lang w:val="uk-UA"/>
+        </w:rPr>
+        <w:t>added</w:t>
+      </w:r>
+      <w:proofErr w:type="spellEnd"/>
+      <w:r>
+        <w:rPr>
+          <w:bCs/>
+          <w:sz w:val="28"/>
+          <w:szCs w:val="28"/>
+          <w:lang w:val="uk-UA"/>
+        </w:rPr>
+        <w:t xml:space="preserve"> </w:t>
+      </w:r>
+      <w:proofErr w:type="spellStart"/>
+      <w:r>
+        <w:rPr>
+          <w:bCs/>
+          <w:sz w:val="28"/>
+          <w:szCs w:val="28"/>
+          <w:lang w:val="uk-UA"/>
+        </w:rPr>
+        <w:t>the</w:t>
+      </w:r>
+      <w:proofErr w:type="spellEnd"/>
+      <w:r>
+        <w:rPr>
+          <w:bCs/>
+          <w:sz w:val="28"/>
+          <w:szCs w:val="28"/>
+          <w:lang w:val="uk-UA"/>
+        </w:rPr>
+        <w:t xml:space="preserve"> </w:t>
+      </w:r>
+      <w:proofErr w:type="spellStart"/>
+      <w:r>
+        <w:rPr>
+          <w:bCs/>
+          <w:sz w:val="28"/>
+          <w:szCs w:val="28"/>
+          <w:lang w:val="uk-UA"/>
+        </w:rPr>
+        <w:t>database</w:t>
+      </w:r>
+      <w:proofErr w:type="spellEnd"/>
+      <w:r>
+        <w:rPr>
+          <w:bCs/>
+          <w:sz w:val="28"/>
+          <w:szCs w:val="28"/>
+          <w:lang w:val="uk-UA"/>
+        </w:rPr>
+        <w:t xml:space="preserve"> </w:t>
+      </w:r>
+      <w:proofErr w:type="spellStart"/>
+      <w:r>
+        <w:rPr>
+          <w:bCs/>
+          <w:sz w:val="28"/>
+          <w:szCs w:val="28"/>
+          <w:lang w:val="uk-UA"/>
+        </w:rPr>
+        <w:t>context</w:t>
+      </w:r>
+      <w:proofErr w:type="spellEnd"/>
     </w:p>
     <w:p>
       <w:pPr>
@@ -8145,6 +8247,7 @@
     </w:p>
     <w:p>
       <w:pPr>
+        <w:jc w:val="center"/>
         <w:rPr>
           <w:bCs/>
           <w:sz w:val="28"/>
@@ -8152,15 +8255,69 @@
           <w:lang w:val="uk-UA"/>
         </w:rPr>
       </w:pPr>
+      <w:r>
+        <w:rPr>
+          <w:bCs/>
+          <w:sz w:val="28"/>
+          <w:szCs w:val="28"/>
+          <w:lang w:val="uk-UA"/>
+        </w:rPr>
+        <w:drawing>
+          <wp:inline distT="0" distB="0" distL="0" distR="0" wp14:anchorId="01E53C17" wp14:editId="6A7AF293">
+            <wp:extent cx="5403850" cy="1746815"/>
+            <wp:effectExtent l="0" t="0" r="6350" b="6350"/>
+            <wp:docPr id="6" name="Рисунок 6"/>
+            <wp:cNvGraphicFramePr>
+              <a:graphicFrameLocks xmlns:a="http://schemas.openxmlformats.org/drawingml/2006/main" noChangeAspect="1"/>
+            </wp:cNvGraphicFramePr>
+            <a:graphic xmlns:a="http://schemas.openxmlformats.org/drawingml/2006/main">
+              <a:graphicData uri="http://schemas.openxmlformats.org/drawingml/2006/picture">
+                <pic:pic xmlns:pic="http://schemas.openxmlformats.org/drawingml/2006/picture">
+                  <pic:nvPicPr>
+                    <pic:cNvPr id="1" name=""/>
+                    <pic:cNvPicPr/>
+                  </pic:nvPicPr>
+                  <pic:blipFill>
+                    <a:blip r:embed="rId14"/>
+                    <a:stretch>
+                      <a:fillRect/>
+                    </a:stretch>
+                  </pic:blipFill>
+                  <pic:spPr>
+                    <a:xfrm>
+                      <a:off x="0" y="0"/>
+                      <a:ext cx="5425456" cy="1753799"/>
+                    </a:xfrm>
+                    <a:prstGeom prst="rect">
+                      <a:avLst/>
+                    </a:prstGeom>
+                  </pic:spPr>
+                </pic:pic>
+              </a:graphicData>
+            </a:graphic>
+          </wp:inline>
+        </w:drawing>
+      </w:r>
     </w:p>
     <w:p>
       <w:pPr>
-        <w:rPr>
-          <w:bCs/>
-          <w:sz w:val="28"/>
-          <w:szCs w:val="28"/>
-        </w:rPr>
-      </w:pPr>
+        <w:jc w:val="center"/>
+        <w:rPr>
+          <w:bCs/>
+          <w:sz w:val="28"/>
+          <w:szCs w:val="28"/>
+          <w:lang w:val="uk-UA"/>
+        </w:rPr>
+      </w:pPr>
+      <w:r>
+        <w:rPr>
+          <w:bCs/>
+          <w:sz w:val="28"/>
+          <w:szCs w:val="28"/>
+          <w:lang w:val="en-US"/>
+        </w:rPr>
+        <w:t>Fig. 4 – DB Context file</w:t>
+      </w:r>
     </w:p>
     <w:p>
       <w:pPr>
@@ -8181,9 +8338,407 @@
           <w:lang w:val="en-US" w:eastAsia="uk-UA"/>
         </w:rPr>
       </w:pPr>
+      <w:r>
+        <w:rPr>
+          <w:noProof/>
+          <w:sz w:val="28"/>
+          <w:szCs w:val="28"/>
+          <w:lang w:val="en-US" w:eastAsia="uk-UA"/>
+        </w:rPr>
+        <w:lastRenderedPageBreak/>
+        <w:t xml:space="preserve">After I did the migrations, a database was created (respectively on the </w:t>
+      </w:r>
+      <w:r>
+        <w:rPr>
+          <w:noProof/>
+          <w:sz w:val="28"/>
+          <w:szCs w:val="28"/>
+          <w:lang w:val="en-US" w:eastAsia="uk-UA"/>
+        </w:rPr>
+        <w:t xml:space="preserve">localdb </w:t>
+      </w:r>
+      <w:r>
+        <w:rPr>
+          <w:noProof/>
+          <w:sz w:val="28"/>
+          <w:szCs w:val="28"/>
+          <w:lang w:val="en-US" w:eastAsia="uk-UA"/>
+        </w:rPr>
+        <w:t>server</w:t>
+      </w:r>
+      <w:r>
+        <w:rPr>
+          <w:noProof/>
+          <w:sz w:val="28"/>
+          <w:szCs w:val="28"/>
+          <w:lang w:val="en-US" w:eastAsia="uk-UA"/>
+        </w:rPr>
+        <w:t xml:space="preserve"> which it was written in the </w:t>
+      </w:r>
+      <w:r>
+        <w:rPr>
+          <w:noProof/>
+          <w:sz w:val="28"/>
+          <w:szCs w:val="28"/>
+          <w:lang w:val="en-US" w:eastAsia="uk-UA"/>
+        </w:rPr>
+        <w:t>appsettings.json</w:t>
+      </w:r>
+      <w:r>
+        <w:rPr>
+          <w:noProof/>
+          <w:sz w:val="28"/>
+          <w:szCs w:val="28"/>
+          <w:lang w:val="en-US" w:eastAsia="uk-UA"/>
+        </w:rPr>
+        <w:t>)</w:t>
+      </w:r>
     </w:p>
     <w:p>
       <w:pPr>
+        <w:jc w:val="both"/>
+        <w:rPr>
+          <w:noProof/>
+          <w:sz w:val="28"/>
+          <w:szCs w:val="28"/>
+          <w:lang w:val="en-US" w:eastAsia="uk-UA"/>
+        </w:rPr>
+      </w:pPr>
+    </w:p>
+    <w:p>
+      <w:pPr>
+        <w:jc w:val="both"/>
+        <w:rPr>
+          <w:noProof/>
+          <w:sz w:val="28"/>
+          <w:szCs w:val="28"/>
+          <w:lang w:val="en-US" w:eastAsia="uk-UA"/>
+        </w:rPr>
+      </w:pPr>
+    </w:p>
+    <w:p>
+      <w:pPr>
+        <w:jc w:val="center"/>
+        <w:rPr>
+          <w:noProof/>
+          <w:sz w:val="28"/>
+          <w:szCs w:val="28"/>
+          <w:lang w:val="en-US" w:eastAsia="uk-UA"/>
+        </w:rPr>
+      </w:pPr>
+      <w:r>
+        <w:rPr>
+          <w:noProof/>
+          <w:sz w:val="28"/>
+          <w:szCs w:val="28"/>
+          <w:lang w:val="en-US" w:eastAsia="uk-UA"/>
+        </w:rPr>
+        <w:drawing>
+          <wp:inline distT="0" distB="0" distL="0" distR="0" wp14:anchorId="19C33028" wp14:editId="1B898F30">
+            <wp:extent cx="5175250" cy="615542"/>
+            <wp:effectExtent l="0" t="0" r="6350" b="0"/>
+            <wp:docPr id="7" name="Рисунок 7"/>
+            <wp:cNvGraphicFramePr>
+              <a:graphicFrameLocks xmlns:a="http://schemas.openxmlformats.org/drawingml/2006/main" noChangeAspect="1"/>
+            </wp:cNvGraphicFramePr>
+            <a:graphic xmlns:a="http://schemas.openxmlformats.org/drawingml/2006/main">
+              <a:graphicData uri="http://schemas.openxmlformats.org/drawingml/2006/picture">
+                <pic:pic xmlns:pic="http://schemas.openxmlformats.org/drawingml/2006/picture">
+                  <pic:nvPicPr>
+                    <pic:cNvPr id="1" name=""/>
+                    <pic:cNvPicPr/>
+                  </pic:nvPicPr>
+                  <pic:blipFill>
+                    <a:blip r:embed="rId15"/>
+                    <a:stretch>
+                      <a:fillRect/>
+                    </a:stretch>
+                  </pic:blipFill>
+                  <pic:spPr>
+                    <a:xfrm>
+                      <a:off x="0" y="0"/>
+                      <a:ext cx="5184056" cy="616589"/>
+                    </a:xfrm>
+                    <a:prstGeom prst="rect">
+                      <a:avLst/>
+                    </a:prstGeom>
+                  </pic:spPr>
+                </pic:pic>
+              </a:graphicData>
+            </a:graphic>
+          </wp:inline>
+        </w:drawing>
+      </w:r>
+    </w:p>
+    <w:p>
+      <w:pPr>
+        <w:jc w:val="center"/>
+        <w:rPr>
+          <w:noProof/>
+          <w:sz w:val="28"/>
+          <w:szCs w:val="28"/>
+          <w:lang w:val="en-US" w:eastAsia="uk-UA"/>
+        </w:rPr>
+      </w:pPr>
+      <w:r>
+        <w:rPr>
+          <w:noProof/>
+          <w:sz w:val="28"/>
+          <w:szCs w:val="28"/>
+          <w:lang w:val="en-US" w:eastAsia="uk-UA"/>
+        </w:rPr>
+        <w:t>Fig. 5 – Doing migrations</w:t>
+      </w:r>
+    </w:p>
+    <w:p>
+      <w:pPr>
+        <w:jc w:val="both"/>
+        <w:rPr>
+          <w:noProof/>
+          <w:sz w:val="28"/>
+          <w:szCs w:val="28"/>
+          <w:lang w:val="en-US" w:eastAsia="uk-UA"/>
+        </w:rPr>
+      </w:pPr>
+    </w:p>
+    <w:p>
+      <w:pPr>
+        <w:jc w:val="both"/>
+        <w:rPr>
+          <w:noProof/>
+          <w:sz w:val="28"/>
+          <w:szCs w:val="28"/>
+          <w:lang w:val="uk-UA" w:eastAsia="uk-UA"/>
+        </w:rPr>
+      </w:pPr>
+      <w:r>
+        <w:rPr>
+          <w:noProof/>
+          <w:sz w:val="28"/>
+          <w:szCs w:val="28"/>
+          <w:lang w:val="en-US" w:eastAsia="uk-UA"/>
+        </w:rPr>
+        <w:t xml:space="preserve">I created </w:t>
+      </w:r>
+      <w:proofErr w:type="spellStart"/>
+      <w:r>
+        <w:t>SeedData</w:t>
+      </w:r>
+      <w:proofErr w:type="spellEnd"/>
+      <w:r>
+        <w:rPr>
+          <w:lang w:val="en-US"/>
+        </w:rPr>
+        <w:t xml:space="preserve">.cs and filled the DB with three </w:t>
+      </w:r>
+      <w:r>
+        <w:rPr>
+          <w:lang w:val="en-US"/>
+        </w:rPr>
+        <w:t>notes</w:t>
+      </w:r>
+    </w:p>
+    <w:p>
+      <w:pPr>
+        <w:jc w:val="both"/>
+        <w:rPr>
+          <w:noProof/>
+          <w:sz w:val="28"/>
+          <w:szCs w:val="28"/>
+          <w:lang w:val="en-US" w:eastAsia="uk-UA"/>
+        </w:rPr>
+      </w:pPr>
+      <w:r>
+        <w:rPr>
+          <w:noProof/>
+          <w:sz w:val="28"/>
+          <w:szCs w:val="28"/>
+          <w:lang w:val="en-US" w:eastAsia="uk-UA"/>
+        </w:rPr>
+        <w:t>F</w:t>
+      </w:r>
+      <w:r>
+        <w:rPr>
+          <w:noProof/>
+          <w:sz w:val="28"/>
+          <w:szCs w:val="28"/>
+          <w:lang w:val="en-US" w:eastAsia="uk-UA"/>
+        </w:rPr>
+        <w:t>inal result</w:t>
+      </w:r>
+    </w:p>
+    <w:p>
+      <w:pPr>
+        <w:jc w:val="center"/>
+        <w:rPr>
+          <w:noProof/>
+          <w:sz w:val="28"/>
+          <w:szCs w:val="28"/>
+          <w:lang w:val="en-US" w:eastAsia="uk-UA"/>
+        </w:rPr>
+      </w:pPr>
+      <w:r>
+        <w:rPr>
+          <w:noProof/>
+          <w:sz w:val="28"/>
+          <w:szCs w:val="28"/>
+          <w:lang w:val="en-US" w:eastAsia="uk-UA"/>
+        </w:rPr>
+        <w:drawing>
+          <wp:inline distT="0" distB="0" distL="0" distR="0" wp14:anchorId="3675EC4A" wp14:editId="025433FF">
+            <wp:extent cx="4254500" cy="1949497"/>
+            <wp:effectExtent l="0" t="0" r="0" b="0"/>
+            <wp:docPr id="8" name="Рисунок 8"/>
+            <wp:cNvGraphicFramePr>
+              <a:graphicFrameLocks xmlns:a="http://schemas.openxmlformats.org/drawingml/2006/main" noChangeAspect="1"/>
+            </wp:cNvGraphicFramePr>
+            <a:graphic xmlns:a="http://schemas.openxmlformats.org/drawingml/2006/main">
+              <a:graphicData uri="http://schemas.openxmlformats.org/drawingml/2006/picture">
+                <pic:pic xmlns:pic="http://schemas.openxmlformats.org/drawingml/2006/picture">
+                  <pic:nvPicPr>
+                    <pic:cNvPr id="1" name=""/>
+                    <pic:cNvPicPr/>
+                  </pic:nvPicPr>
+                  <pic:blipFill>
+                    <a:blip r:embed="rId16"/>
+                    <a:stretch>
+                      <a:fillRect/>
+                    </a:stretch>
+                  </pic:blipFill>
+                  <pic:spPr>
+                    <a:xfrm>
+                      <a:off x="0" y="0"/>
+                      <a:ext cx="4260100" cy="1952063"/>
+                    </a:xfrm>
+                    <a:prstGeom prst="rect">
+                      <a:avLst/>
+                    </a:prstGeom>
+                  </pic:spPr>
+                </pic:pic>
+              </a:graphicData>
+            </a:graphic>
+          </wp:inline>
+        </w:drawing>
+      </w:r>
+    </w:p>
+    <w:p>
+      <w:pPr>
+        <w:jc w:val="center"/>
+        <w:rPr>
+          <w:noProof/>
+          <w:sz w:val="28"/>
+          <w:szCs w:val="28"/>
+          <w:lang w:val="en-US" w:eastAsia="uk-UA"/>
+        </w:rPr>
+      </w:pPr>
+      <w:r>
+        <w:rPr>
+          <w:noProof/>
+          <w:sz w:val="28"/>
+          <w:szCs w:val="28"/>
+          <w:lang w:val="en-US" w:eastAsia="uk-UA"/>
+        </w:rPr>
+        <w:t>Fig. 6 – My main screen</w:t>
+      </w:r>
+    </w:p>
+    <w:p>
+      <w:pPr>
+        <w:jc w:val="center"/>
+        <w:rPr>
+          <w:noProof/>
+          <w:sz w:val="28"/>
+          <w:szCs w:val="28"/>
+          <w:lang w:val="en-US" w:eastAsia="uk-UA"/>
+        </w:rPr>
+      </w:pPr>
+      <w:r>
+        <w:rPr>
+          <w:noProof/>
+          <w:sz w:val="28"/>
+          <w:szCs w:val="28"/>
+          <w:lang w:val="en-US" w:eastAsia="uk-UA"/>
+        </w:rPr>
+        <w:drawing>
+          <wp:inline distT="0" distB="0" distL="0" distR="0" wp14:anchorId="70172199" wp14:editId="168A26D7">
+            <wp:extent cx="4324350" cy="1446681"/>
+            <wp:effectExtent l="0" t="0" r="0" b="1270"/>
+            <wp:docPr id="9" name="Рисунок 9"/>
+            <wp:cNvGraphicFramePr>
+              <a:graphicFrameLocks xmlns:a="http://schemas.openxmlformats.org/drawingml/2006/main" noChangeAspect="1"/>
+            </wp:cNvGraphicFramePr>
+            <a:graphic xmlns:a="http://schemas.openxmlformats.org/drawingml/2006/main">
+              <a:graphicData uri="http://schemas.openxmlformats.org/drawingml/2006/picture">
+                <pic:pic xmlns:pic="http://schemas.openxmlformats.org/drawingml/2006/picture">
+                  <pic:nvPicPr>
+                    <pic:cNvPr id="1" name=""/>
+                    <pic:cNvPicPr/>
+                  </pic:nvPicPr>
+                  <pic:blipFill>
+                    <a:blip r:embed="rId17"/>
+                    <a:stretch>
+                      <a:fillRect/>
+                    </a:stretch>
+                  </pic:blipFill>
+                  <pic:spPr>
+                    <a:xfrm>
+                      <a:off x="0" y="0"/>
+                      <a:ext cx="4350167" cy="1455318"/>
+                    </a:xfrm>
+                    <a:prstGeom prst="rect">
+                      <a:avLst/>
+                    </a:prstGeom>
+                  </pic:spPr>
+                </pic:pic>
+              </a:graphicData>
+            </a:graphic>
+          </wp:inline>
+        </w:drawing>
+      </w:r>
+    </w:p>
+    <w:p>
+      <w:pPr>
+        <w:jc w:val="center"/>
+        <w:rPr>
+          <w:noProof/>
+          <w:sz w:val="28"/>
+          <w:szCs w:val="28"/>
+          <w:lang w:val="en-US" w:eastAsia="uk-UA"/>
+        </w:rPr>
+      </w:pPr>
+      <w:r>
+        <w:rPr>
+          <w:noProof/>
+          <w:sz w:val="28"/>
+          <w:szCs w:val="28"/>
+          <w:lang w:val="en-US" w:eastAsia="uk-UA"/>
+        </w:rPr>
+        <w:t>Fig. 7 – Second page</w:t>
+      </w:r>
+    </w:p>
+    <w:p>
+      <w:pPr>
+        <w:jc w:val="both"/>
+        <w:rPr>
+          <w:noProof/>
+          <w:sz w:val="28"/>
+          <w:szCs w:val="28"/>
+          <w:lang w:val="en-US" w:eastAsia="uk-UA"/>
+        </w:rPr>
+      </w:pPr>
+    </w:p>
+    <w:p>
+      <w:pPr>
+        <w:jc w:val="both"/>
+        <w:rPr>
+          <w:noProof/>
+          <w:sz w:val="28"/>
+          <w:szCs w:val="28"/>
+          <w:lang w:val="en-US" w:eastAsia="uk-UA"/>
+        </w:rPr>
+      </w:pPr>
+    </w:p>
+    <w:p>
+      <w:pPr>
         <w:ind w:firstLine="709"/>
         <w:jc w:val="both"/>
         <w:rPr>
@@ -9031,8 +9586,8 @@
       </w:r>
     </w:p>
     <w:sectPr>
-      <w:headerReference w:type="default" r:id="rId14"/>
-      <w:headerReference w:type="first" r:id="rId15"/>
+      <w:headerReference w:type="default" r:id="rId18"/>
+      <w:headerReference w:type="first" r:id="rId19"/>
       <w:pgSz w:w="11906" w:h="16838"/>
       <w:pgMar w:top="567" w:right="567" w:bottom="1418" w:left="1418" w:header="709" w:footer="709" w:gutter="0"/>
       <w:pgNumType w:start="1"/>
@@ -13378,8 +13933,16 @@
                               <w:jc w:val="center"/>
                               <w:rPr>
                                 <w:sz w:val="20"/>
+                                <w:lang w:val="en-US"/>
                               </w:rPr>
                             </w:pPr>
+                            <w:r>
+                              <w:rPr>
+                                <w:sz w:val="20"/>
+                                <w:lang w:val="en-US"/>
+                              </w:rPr>
+                              <w:t>5</w:t>
+                            </w:r>
                           </w:p>
                         </w:txbxContent>
                       </wps:txbx>
@@ -14349,8 +14912,16 @@
                         <w:jc w:val="center"/>
                         <w:rPr>
                           <w:sz w:val="20"/>
+                          <w:lang w:val="en-US"/>
                         </w:rPr>
                       </w:pPr>
+                      <w:r>
+                        <w:rPr>
+                          <w:sz w:val="20"/>
+                          <w:lang w:val="en-US"/>
+                        </w:rPr>
+                        <w:t>5</w:t>
+                      </w:r>
                     </w:p>
                   </w:txbxContent>
                 </v:textbox>

</xml_diff>